<commit_message>
Add real epidemiology/school-closure background to The Curve's Turn
Cites CDC's 2020 "Indicators for Dynamic School Decision-Making" framework
(risk-tiered guidance, decision made locally, not one universal cutoff -- ties
directly into the case's own disclosed MA2 scenario threshold) and CDC's
Principles of Epidemiology on why outbreak curves rise-then-decline, which is
the real reason finding the concavity turn (Challenge D4) is a genuine
epidemiological technique, not an invented math exercise. One new glossary
term (Closure Threshold), no duplication with the 6 already added. Math,
margin (11.68%), and the SPEC Sec 6 calm/administrative tone all unchanged.

Co-Authored-By: Claude Sonnet 5 <noreply@anthropic.com>
</commit_message>
<xml_diff>
--- a/cases/curves-turn/published/The Curve's Turn - Case Study.docx
+++ b/cases/curves-turn/published/The Curve's Turn - Case Study.docx
@@ -127,6 +127,26 @@
     <w:p>
       <w:r>
         <w:t xml:space="preserve">Vance is judged on one number, and the board has written that down too: chain-weighted in-school transmissions per one thousand students across the board's stated evaluation horizon (SEE APPENDIX D). The prevention model, the transmission coefficient and the chain multiplier that turn a county case rate into that number are all set out there. The vocabulary and the "how to…" skills this case will ask of you are listed in (SEE APPENDIX H) — that is where Challenge 1 sends you. For real, freely available background reading on epidemic curves, school testing programmes and the county itself, beyond what the case requires, (SEE APPENDIX G).</w:t>
+      </w:r>
+    </w:p>
+    <w:p>
+      <w:r>
+        <w:t xml:space="preserve">In the real world, no single number tells every district when to close. The U.S. CDC's own 2020 framework for school operating-status decisions sets several risk-tiered ranges at once — for case rate </w:t>
+      </w:r>
+      <w:r>
+        <w:rPr>
+          <w:i/>
+          <w:iCs/>
+        </w:rPr>
+        <w:t xml:space="preserve">and</w:t>
+      </w:r>
+      <w:r>
+        <w:t xml:space="preserve"> for test positivity — and states plainly that these ranges are guideposts, not fixed cutoffs, and that the actual call is made locally, by health officials and school administrators working with their own community, not handed down by CDC itself. Real thresholds also vary by jurisdiction and by how severe the disease in question is — a rule written for one county in one outbreak is not a rule for every county in every outbreak. The board's own closure threshold in (SEE APPENDIX C) works the same way: it is this case's own stated scenario constraint for a fictional board (SEE APPENDIX F, MA2), not a published real-world standard.</w:t>
+      </w:r>
+    </w:p>
+    <w:p>
+      <w:r>
+        <w:t xml:space="preserve">The shape behind both plans — cases rising, then rising faster, then turning and falling away — is not unique to this county either. Epidemiologists call a chart like Appendices A and B an epidemic curve, and outbreaks of this kind typically climb steeply and decline more gradually, for reasons epidemiology itself explains: transmission chains usually wane after a few generations, either because the number of people left to infect falls below what is needed to sustain spread, or because the response measures already under way start working. Finding the week a real curve like this stops accelerating — the week its concavity flips from turning-upward to turning-over — is exactly the technique real epidemiologists and public-health analysts use to spot a wave's turn before its peak, which is what Appendix D's model and Challenge D4 ask you to do here.</w:t>
       </w:r>
     </w:p>
     <w:p>
@@ -3233,7 +3253,7 @@
             <w:r>
               <w:t xml:space="preserve"> (</w:t>
             </w:r>
-            <w:hyperlink w:history="1" r:id="rIdrg04hglfdgoakg9ndrvy3">
+            <w:hyperlink w:history="1" r:id="rIdp7rat0l2r1vtbqjqdkhec">
               <w:r>
                 <w:rPr>
                   <w:rStyle w:val="Hyperlink"/>
@@ -3324,7 +3344,7 @@
             <w:r>
               <w:t xml:space="preserve"> (</w:t>
             </w:r>
-            <w:hyperlink w:history="1" r:id="rIdvo22meafhl44ohbh57q_p">
+            <w:hyperlink w:history="1" r:id="rIda2bemhmek6exzeuwrnkir">
               <w:r>
                 <w:rPr>
                   <w:rStyle w:val="Hyperlink"/>
@@ -3406,7 +3426,7 @@
             <w:r>
               <w:t xml:space="preserve"> (</w:t>
             </w:r>
-            <w:hyperlink w:history="1" r:id="rId7dj0anzd7oudv8njfisvj">
+            <w:hyperlink w:history="1" r:id="rIdyp4pr6f2mnggb5nvfbos5">
               <w:r>
                 <w:rPr>
                   <w:rStyle w:val="Hyperlink"/>
@@ -3488,7 +3508,7 @@
             <w:r>
               <w:t xml:space="preserve"> (</w:t>
             </w:r>
-            <w:hyperlink w:history="1" r:id="rIdwmxqwe9cxnfxq3oopwksx">
+            <w:hyperlink w:history="1" r:id="rIdibdsd8q1oqdefisvimlix">
               <w:r>
                 <w:rPr>
                   <w:rStyle w:val="Hyperlink"/>
@@ -3561,7 +3581,7 @@
             <w:r>
               <w:t xml:space="preserve">Cochrane, Dinnes J, Berhane S, Walsh J et al., "Rapid, point-of-care antigen tests for diagnosis of SARS-CoV-2 infection", CD013705, 28 November 2025 (</w:t>
             </w:r>
-            <w:hyperlink w:history="1" r:id="rIdllix2leu56ifbam0fse5x">
+            <w:hyperlink w:history="1" r:id="rIdlsykljbevwil7cuh8_v4n">
               <w:r>
                 <w:rPr>
                   <w:rStyle w:val="Hyperlink"/>
@@ -3634,7 +3654,7 @@
             <w:r>
               <w:t xml:space="preserve">CDC, "Science Brief: Transmission of SARS-CoV-2 in K-12 Schools and Early Care and Education Programs — Updated", last updated 17 December 2021 (</w:t>
             </w:r>
-            <w:hyperlink w:history="1" r:id="rIdynelz87udosgtmci4sopi">
+            <w:hyperlink w:history="1" r:id="rId1uft59y2vozlfgsrnhqbo">
               <w:r>
                 <w:rPr>
                   <w:rStyle w:val="Hyperlink"/>
@@ -3714,7 +3734,7 @@
             <w:r>
               <w:t xml:space="preserve"> — ordinary least squares on Appendix A's New cases column, from S1 (</w:t>
             </w:r>
-            <w:hyperlink w:history="1" r:id="rId1egiodufwm17m1luifnd2">
+            <w:hyperlink w:history="1" r:id="rId_xmysl0zfa40egpd9gtko">
               <w:r>
                 <w:rPr>
                   <w:rStyle w:val="Hyperlink"/>
@@ -3794,7 +3814,7 @@
             <w:r>
               <w:t xml:space="preserve"> — ordinary least squares on Appendix B's New cases column, from S1 (</w:t>
             </w:r>
-            <w:hyperlink w:history="1" r:id="rIditt-wuhdwew1jiastu28n">
+            <w:hyperlink w:history="1" r:id="rIdpetring3qgkymgzsauqsa">
               <w:r>
                 <w:rPr>
                   <w:rStyle w:val="Hyperlink"/>
@@ -4051,7 +4071,7 @@
               <w:t xml:space="preserve">escalation</w:t>
             </w:r>
             <w:r>
-              <w:t xml:space="preserve"> trigger has to set one above the top of the national scale. 500 is five times the CDC high-transmission floor, and sits between the two plans' computed closure weeks rather than on top of either.</w:t>
+              <w:t xml:space="preserve"> trigger has to set one above the top of the national scale. 500 is five times the CDC high-transmission floor, and sits between the two plans' computed closure weeks rather than on top of either. Real school-closure thresholds are not a single universal number either — CDC's own 2020 school-decision framework (see Background and Appendix G) publishes several risk-tiered ranges at once and leaves the actual call to local officials, which is the same reason this board's own written level has to be stated here as a scenario assumption rather than looked up.</w:t>
             </w:r>
           </w:p>
         </w:tc>
@@ -4635,7 +4655,7 @@
       <w:r>
         <w:t xml:space="preserve">- </w:t>
       </w:r>
-      <w:hyperlink w:history="1" r:id="rId-a5juunyu_ycqwbbk8n6u">
+      <w:hyperlink w:history="1" r:id="rId5opmlorarxo65leva36jh">
         <w:r>
           <w:rPr>
             <w:rStyle w:val="Hyperlink"/>
@@ -4654,7 +4674,26 @@
       <w:r>
         <w:t xml:space="preserve">- </w:t>
       </w:r>
-      <w:hyperlink w:history="1" r:id="rIdkailcabjcyhgu_4dkylc7">
+      <w:hyperlink w:history="1" r:id="rIdrjhepb1pfcpvls4modo4e">
+        <w:r>
+          <w:rPr>
+            <w:rStyle w:val="Hyperlink"/>
+          </w:rPr>
+          <w:t xml:space="preserve">Principles of Epidemiology in Public Health Practice, Lesson 1, Section 11 — CDC</w:t>
+        </w:r>
+      </w:hyperlink>
+      <w:r>
+        <w:t xml:space="preserve"> — CDC's own training material on why epidemic curves have the shape they do: a steep rise and a more gradual decline, and the two real reasons a wave typically turns over.</w:t>
+      </w:r>
+    </w:p>
+    <w:p>
+      <w:pPr>
+        <w:ind w:left="360"/>
+      </w:pPr>
+      <w:r>
+        <w:t xml:space="preserve">- </w:t>
+      </w:r>
+      <w:hyperlink w:history="1" r:id="rIdavwxvt4saixpcwndyuxch">
         <w:r>
           <w:rPr>
             <w:rStyle w:val="Hyperlink"/>
@@ -4673,7 +4712,7 @@
       <w:r>
         <w:t xml:space="preserve">- </w:t>
       </w:r>
-      <w:hyperlink w:history="1" r:id="rIdb9ct7h2pj9bnzsivptxtt">
+      <w:hyperlink w:history="1" r:id="rIdsygs5cnxlinxrapjaqpdp">
         <w:r>
           <w:rPr>
             <w:rStyle w:val="Hyperlink"/>
@@ -4692,7 +4731,26 @@
       <w:r>
         <w:t xml:space="preserve">- </w:t>
       </w:r>
-      <w:hyperlink w:history="1" r:id="rIdb7iak_5-9us58nyjfq4ih">
+      <w:hyperlink w:history="1" r:id="rIdfwnaddxz-53mwy3htvoot">
+        <w:r>
+          <w:rPr>
+            <w:rStyle w:val="Hyperlink"/>
+          </w:rPr>
+          <w:t xml:space="preserve">CDC Releases Indicators for Dynamic School Decision-Making — CDC</w:t>
+        </w:r>
+      </w:hyperlink>
+      <w:r>
+        <w:t xml:space="preserve"> — CDC's real 2020 framework of risk-tiered case-rate and test-positivity ranges for school operating status, and its own statement that the decision is made locally, not by CDC.</w:t>
+      </w:r>
+    </w:p>
+    <w:p>
+      <w:pPr>
+        <w:ind w:left="360"/>
+      </w:pPr>
+      <w:r>
+        <w:t xml:space="preserve">- </w:t>
+      </w:r>
+      <w:hyperlink w:history="1" r:id="rIdxxx6a2lsb2y2mfubrnx1c">
         <w:r>
           <w:rPr>
             <w:rStyle w:val="Hyperlink"/>
@@ -4711,7 +4769,7 @@
       <w:r>
         <w:t xml:space="preserve">- </w:t>
       </w:r>
-      <w:hyperlink w:history="1" r:id="rId3m2p-njv2bhm092wsxflg">
+      <w:hyperlink w:history="1" r:id="rIdegjj7dtvfl3jwnjvz6qs5">
         <w:r>
           <w:rPr>
             <w:rStyle w:val="Hyperlink"/>
@@ -4754,7 +4812,7 @@
       <w:r>
         <w:t xml:space="preserve"> — how many new cases show up relative to the size of the population, usually per   100,000 people over a set time like a week. Unlike a raw case count, a rate lets you compare   different places or times fairly. </w:t>
       </w:r>
-      <w:hyperlink w:history="1" r:id="rId_8tfobaax0mxlklg4a4sz">
+      <w:hyperlink w:history="1" r:id="rIdi6sc3isdqtw_-1fnugwc8">
         <w:r>
           <w:rPr>
             <w:rStyle w:val="Hyperlink"/>
@@ -4780,7 +4838,7 @@
       <w:r>
         <w:t xml:space="preserve"> — early case reports get corrected as more complete information reaches health   departments; a week's count reported today is often adjusted up or down in the weeks that follow,   which is why the Overview calls the reported line "reported, revised, ragged." </w:t>
       </w:r>
-      <w:hyperlink w:history="1" r:id="rIdtavlaav0v03xrvs8x9-yt">
+      <w:hyperlink w:history="1" r:id="rIdknwtbpy_xjpm7m4nqwj0k">
         <w:r>
           <w:rPr>
             <w:rStyle w:val="Hyperlink"/>
@@ -4806,7 +4864,7 @@
       <w:r>
         <w:t xml:space="preserve"> — CDC's four-tier scale (low, moderate, substantial, high) for   how much a virus is spreading in a county, based on new cases per 100,000 residents in the past 7   days. </w:t>
       </w:r>
-      <w:hyperlink w:history="1" r:id="rIdlwaogqqjczrnyw65s-s6q">
+      <w:hyperlink w:history="1" r:id="rIdqvnd3vwwytsfyymagg6d3">
         <w:r>
           <w:rPr>
             <w:rStyle w:val="Hyperlink"/>
@@ -4832,7 +4890,7 @@
       <w:r>
         <w:t xml:space="preserve"> — the share of a known case's close contacts (classmates, housemates)   who go on to catch the disease themselves — a measure of how easily something spreads once it is   already inside a group. </w:t>
       </w:r>
-      <w:hyperlink w:history="1" r:id="rIdvxzffylzsr3tqa0ogkoud">
+      <w:hyperlink w:history="1" r:id="rIdqedrsuxghm3xywowabobc">
         <w:r>
           <w:rPr>
             <w:rStyle w:val="Hyperlink"/>
@@ -4858,7 +4916,7 @@
       <w:r>
         <w:t xml:space="preserve"> — how often a test correctly flags someone who truly has the   infection; a highly sensitive test misses few real cases. </w:t>
       </w:r>
-      <w:hyperlink w:history="1" r:id="rId5fbs_od5fxgw1ogxu2qaa">
+      <w:hyperlink w:history="1" r:id="rIdxuciymhzaujsx8nfhqutq">
         <w:r>
           <w:rPr>
             <w:rStyle w:val="Hyperlink"/>
@@ -4884,7 +4942,7 @@
       <w:r>
         <w:t xml:space="preserve"> — how often a test correctly clears someone who does not have the   infection; a highly specific test gives few false alarms. No test is perfect at both. </w:t>
       </w:r>
-      <w:hyperlink w:history="1" r:id="rIds_i5yiudokjvfct9vi5st">
+      <w:hyperlink w:history="1" r:id="rIdlpjw7itvfjndpmdmb-bw4">
         <w:r>
           <w:rPr>
             <w:rStyle w:val="Hyperlink"/>
@@ -4910,12 +4968,38 @@
       <w:r>
         <w:t xml:space="preserve"> — a chart of new cases over time showing the shape of an outbreak as it rises,   peaks and falls — the exact kind of chart Appendices A and B are built from. </w:t>
       </w:r>
-      <w:hyperlink w:history="1" r:id="rIdz8tzfygzmm3q30rq0kqfk">
+      <w:hyperlink w:history="1" r:id="rIdiixzxat3eb3f_xapyrhae">
         <w:r>
           <w:rPr>
             <w:rStyle w:val="Hyperlink"/>
           </w:rPr>
           <w:t xml:space="preserve">Epidemic curve — Wikipedia</w:t>
+        </w:r>
+      </w:hyperlink>
+    </w:p>
+    <w:p>
+      <w:pPr>
+        <w:ind w:left="360"/>
+      </w:pPr>
+      <w:r>
+        <w:t xml:space="preserve">- </w:t>
+      </w:r>
+      <w:r>
+        <w:rPr>
+          <w:b/>
+          <w:bCs/>
+        </w:rPr>
+        <w:t xml:space="preserve">Closure threshold</w:t>
+      </w:r>
+      <w:r>
+        <w:t xml:space="preserve"> — the specific case-rate or test-positivity number a real policy writes   down to trigger a change in school operating status. Real frameworks publish several such ranges   as guideposts rather than one universal cutoff, and the actual call is made by local health   officials and school administrators, not by a national health agency — which is why this case's   own board level (Appendix C, Appendix F MA2) is stated as a scenario assumption rather than a   looked-up fact. </w:t>
+      </w:r>
+      <w:hyperlink w:history="1" r:id="rIdzbtw0ax5vmlk-zhjdmwef">
+        <w:r>
+          <w:rPr>
+            <w:rStyle w:val="Hyperlink"/>
+          </w:rPr>
+          <w:t xml:space="preserve">CDC Releases Indicators for Dynamic School Decision-Making</w:t>
         </w:r>
       </w:hyperlink>
     </w:p>

</xml_diff>